<commit_message>
v5.1: reader notes on BB Eps 2-3 (backstory, echo reactions, grooming asides), rules 8-10 and lint
Co-Authored-By: Claude Opus 5.5 <noreply@anthropic.com>
Claude-Session: https://claude.ai/code/session_01DLiPTFqGsgvkpoKrfpM3uL
</commit_message>
<xml_diff>
--- a/out/BB_v5.1_Eps1-10.docx
+++ b/out/BB_v5.1_Eps1-10.docx
@@ -114,7 +114,7 @@
     </w:p>
     <w:p>
       <w:r>
-        <w:t>lift കയറി പല്ലവിയുടെ flat-ന്റെ വാതിൽക്കൽ അവരെത്തി. മീരയ്ക്ക് സന്തോഷം അടക്കാനായില്ല. എത്ര കാലം കഴിഞ്ഞാ ചേച്ചിയെ കാണുന്നേ! അച്ഛൻ bag-ലേക്ക് നോക്കി ഒന്നു നെടുവീർപ്പിട്ടു. “ഇത്ര സ്നേഹത്തോടെ അവൾക്കു വേണ്ടി ഉണ്ടാക്കിയ അച്ചപ്പം താഴെ വീണ് പൊട്ടിപ്പോയല്ലോ..” മീര ചിരിച്ചു. “അതിനെന്താ അച്ഛാ? പൊട്ടിയാലും അച്ചപ്പത്തിന്റെ മധുരം അതു തന്നെയല്ലേ?” അച്ഛനും ചിരിച്ചു. തോർത്തു കൊണ്ട് മുഖം ഒന്ന് അമർത്തിത്തുടച്ച് അദ്ദേഹം മുണ്ട് നേരെയാക്കി. മൂന്നു വർഷം കഴിഞ്ഞ് കാണുന്ന മോളുടെ മുന്നിൽ ഈ കോലത്തിൽ ചെല്ലണ്ടല്ലോ. മീര bell അടിച്ചു.</w:t>
+        <w:t>lift കയറി പല്ലവിയുടെ flat-ന്റെ വാതിൽക്കൽ അവരെത്തി. മീരയ്ക്ക് സന്തോഷം അടക്കാനായില്ല. എത്ര കാലം കഴിഞ്ഞാ ചേച്ചിയെ കാണുന്നേ! അച്ഛൻ bag-ലേക്ക് നോക്കി ഒന്നു നെടുവീർപ്പിട്ടു. “ഇത്ര സ്നേഹത്തോടെ അവൾക്കു വേണ്ടി ഉണ്ടാക്കിയ അച്ചപ്പം താഴെ വീണ് പൊട്ടിപ്പോയല്ലോ..” മീര ചിരിച്ചു. “അതിനെന്താ അച്ഛാ? പൊട്ടിയാലും അച്ചപ്പത്തിന്റെ മധുരം അതു തന്നെയല്ലേ?” അച്ഛനും ചിരിച്ചു. മീര bell അടിച്ചു.</w:t>
       </w:r>
     </w:p>
     <w:p>
@@ -160,12 +160,12 @@
     </w:p>
     <w:p>
       <w:r>
-        <w:t>അച്ഛന്റെ ശബ്ദം ഇടറി. നിന്നെ city-യിലേക്ക് വിട്ടത് നീ എന്തെങ്കിലും ആകാൻ വേണ്ടിയാ. വിളവ് വിറ്റാ നിന്റെ fees അടച്ചത്. ആ വർഷം വീട്ടിലെ പശുവിനെ വരെ വിറ്റു. “ഞാനും നിന്റെ അനിയത്തിയും രാവും പകലും പാടത്ത് പണിയെടുത്തു. എന്നിട്ട് ഇപ്പോ എന്നെ അച്ഛാ എന്ന് വിളിക്കാൻ നിനക്ക് നാണക്കേടാണോ?” പല്ലവി മുഖം തിരിച്ചു. അച്ഛന്റെ മുഖത്തേക്ക് നോക്കാൻ പോലും അവൾക്ക് പറ്റുന്നില്ല.</w:t>
+        <w:t>അച്ഛന്റെ ശബ്ദം ഇടറി. നിന്നെ city-യിലേക്ക് വിട്ടത് നീ എന്തെങ്കിലും ആകാൻ വേണ്ടിയാ. വിളവ് വിറ്റാ നിന്റെ fees അടച്ചത്. “ഞാനും നിന്റെ അനിയത്തിയും രാവും പകലും പാടത്ത് പണിയെടുത്തു. എന്നിട്ട് ഇപ്പോ എന്നെ അച്ഛാ എന്ന് വിളിക്കാൻ നിനക്ക് നാണക്കേടാണോ?”</w:t>
       </w:r>
     </w:p>
     <w:p>
       <w:r>
-        <w:t>അപ്പോഴേക്കും Vicky shirt-ന്റെ button ഇട്ടുകൊണ്ട് വാതിൽക്കലേക്ക് വന്നു. അവരുടെ നാടൻ വേഷം കണ്ടു. അച്ഛൻ പറഞ്ഞത് കേട്ടു. അവന്റെ മുഖം ചുവന്നു. അവൻ പല്ലവിയെ ഒരു വശത്തേക്ക് മാറ്റി വാതിൽ മുഴുവനായി തുറന്നു. “എന്താ പറഞ്ഞേ? അച്ഛനോ? ഈ കൂലിപ്പണിക്കാരനെപ്പോലിരിക്കുന്ന കിളവനാണോ നിന്റെ അച്ഛൻ? നിന്റെ papa Delhi-യിലെ വലിയ businessman ആണെന്നല്ലേ നീ പറഞ്ഞത്? ഏതോ jeweller.. 5000 കോടിയുടെ net worth..” മീര ചേച്ചിയെ തുറിച്ചു നോക്കി. jeweller-ഓ? നമ്മുടെ അച്ഛനോ?</w:t>
+        <w:t>അപ്പോഴേക്കും Vicky shirt-ന്റെ button ഇട്ടുകൊണ്ട് വാതിൽക്കലേക്ക് വന്നു. അവരുടെ നാടൻ വേഷം കണ്ടു. അച്ഛൻ പറഞ്ഞത് കേട്ടു. അവന്റെ മുഖം ചുവന്നു. അവൻ പല്ലവിയെ ഒരു വശത്തേക്ക് മാറ്റി വാതിൽ മുഴുവനായി തുറന്നു. “എന്താ പറഞ്ഞേ? അച്ഛനോ? ഈ കൂലിപ്പണിക്കാരനെപ്പോലിരിക്കുന്ന കിളവനാണോ നിന്റെ അച്ഛൻ? നിന്റെ papa Delhi-യിലെ വലിയ businessman ആണെന്നല്ലേ നീ പറഞ്ഞത്? ഏതോ jeweller.. 5000 കോടിയുടെ net worth..”</w:t>
       </w:r>
     </w:p>
     <w:p>

</xml_diff>